<commit_message>
Lead the MVP docs with the why + APPA mission fit
Add a 'Why this matters - and how it fits APPA's mission' lead section to the
top of the Proof-of-Concept Plan (Rosetta Stone framing, ~$2.5M mission spend,
a mission-priority -> local-mechanism table, and how the MVP tests mission-
amplification not just the P&L). Reorder the Execution Kit one-pager to lead
with the why. Regenerate both Word exports.

Co-Authored-By: Claude Opus 4.8 (1M context) <noreply@anthropic.com>
Claude-Session: https://claude.ai/code/session_016gWMtWeutWcnpqhZxT7WHC
</commit_message>
<xml_diff>
--- a/PoC-MVP-Execution-Kit.docx
+++ b/PoC-MVP-Execution-Kit.docx
@@ -221,6 +221,44 @@
         <w:rPr>
           <w:b/>
         </w:rPr>
+        <w:t>Why — and how it fits APPA's mission (the Rosetta Stone):</w:t>
+      </w:r>
+      <w:r>
+        <w:t xml:space="preserve"> APPA already spends </w:t>
+      </w:r>
+      <w:r>
+        <w:rPr>
+          <w:b/>
+        </w:rPr>
+        <w:t>~$2.5M/year</w:t>
+      </w:r>
+      <w:r>
+        <w:t xml:space="preserve"> on mission work that depends on local community/connectivity but has </w:t>
+      </w:r>
+      <w:r>
+        <w:rPr>
+          <w:b/>
+        </w:rPr>
+        <w:t>no local delivery channel.</w:t>
+      </w:r>
+      <w:r>
+        <w:t xml:space="preserve"> This pilot proves PoC can be that channel — turning </w:t>
+      </w:r>
+      <w:r>
+        <w:rPr>
+          <w:b/>
+        </w:rPr>
+        <w:t>advocacy from an expense into a profit center</w:t>
+      </w:r>
+      <w:r>
+        <w:t xml:space="preserve"> by solving pet-care's biggest problems (declining vet visits, pet-inclusive housing, independent-retail/live-sales threats, stalled ownership, member-brand local connection) *and making money doing it.* Mission and margin pull the same direction.</w:t>
+      </w:r>
+    </w:p>
+    <w:p>
+      <w:r>
+        <w:rPr>
+          <w:b/>
+        </w:rPr>
         <w:t>What:</w:t>
       </w:r>
       <w:r>
@@ -249,35 +287,6 @@
           <w:b/>
         </w:rPr>
         <w:t>4 Southeast markets: Chattanooga (HQ/lead), Brentwood/Franklin (member-brand HQ hub), Columbia, Raleigh.</w:t>
-      </w:r>
-    </w:p>
-    <w:p>
-      <w:r>
-        <w:rPr>
-          <w:b/>
-        </w:rPr>
-        <w:t>Why (the Rosetta Stone):</w:t>
-      </w:r>
-      <w:r>
-        <w:t xml:space="preserve"> Prove we can turn </w:t>
-      </w:r>
-      <w:r>
-        <w:rPr>
-          <w:b/>
-        </w:rPr>
-        <w:t>advocacy into a profit center</w:t>
-      </w:r>
-      <w:r>
-        <w:t xml:space="preserve"> — solving pet-care's biggest problems (declining vet visits, pet-inclusive housing, independent-retail/live-sales threats, stalled ownership) *and making money doing it* — while giving APPA its first </w:t>
-      </w:r>
-      <w:r>
-        <w:rPr>
-          <w:b/>
-        </w:rPr>
-        <w:t>local delivery channel</w:t>
-      </w:r>
-      <w:r>
-        <w:t xml:space="preserve"> for the ~$2.5M/year it already spends on mission.</w:t>
       </w:r>
     </w:p>
     <w:p>

</xml_diff>